<commit_message>
Update project report documents
Co-Authored-By: Claude Opus 5.5 <noreply@anthropic.com>
</commit_message>
<xml_diff>
--- a/LuNaVision_AI_Project_Report_final_56pages.docx
+++ b/LuNaVision_AI_Project_Report_final_56pages.docx
@@ -2133,7 +2133,7 @@
         </w:rPr>
         <w:t xml:space="preserve">5.8 Train, Validation and Test Split</w:t>
         <w:tab/>
-        <w:t>26</w:t>
+        <w:t>25</w:t>
       </w:r>
       <w:proofErr w:type="gramEnd"/>
     </w:p>
@@ -2153,7 +2153,7 @@
         </w:rPr>
         <w:t xml:space="preserve">6.  METHODOLOGY AND IMPLEMENTATION</w:t>
         <w:tab/>
-        <w:t>27</w:t>
+        <w:t>26</w:t>
       </w:r>
     </w:p>
     <w:p>
@@ -2172,7 +2172,7 @@
         </w:rPr>
         <w:t xml:space="preserve">6.1 Stage 1: Data Acquisition</w:t>
         <w:tab/>
-        <w:t>27</w:t>
+        <w:t>26</w:t>
       </w:r>
       <w:proofErr w:type="gramEnd"/>
     </w:p>
@@ -2192,7 +2192,7 @@
         </w:rPr>
         <w:t xml:space="preserve">6.2 Stage 2: Preprocessing and Detrending</w:t>
         <w:tab/>
-        <w:t>28</w:t>
+        <w:t>27</w:t>
       </w:r>
       <w:proofErr w:type="gramEnd"/>
     </w:p>
@@ -2212,7 +2212,7 @@
         </w:rPr>
         <w:t xml:space="preserve">6.3 Stage 3: Periodicity Detection</w:t>
         <w:tab/>
-        <w:t>30</w:t>
+        <w:t>29</w:t>
       </w:r>
       <w:proofErr w:type="gramEnd"/>
     </w:p>
@@ -2232,7 +2232,7 @@
         </w:rPr>
         <w:t xml:space="preserve">6.4 Stage 4: Feature Engineering</w:t>
         <w:tab/>
-        <w:t>31</w:t>
+        <w:t>30</w:t>
       </w:r>
       <w:proofErr w:type="gramEnd"/>
     </w:p>
@@ -2252,7 +2252,7 @@
         </w:rPr>
         <w:t xml:space="preserve">6.5 Stage 5: Classification</w:t>
         <w:tab/>
-        <w:t>33</w:t>
+        <w:t>32</w:t>
       </w:r>
       <w:proofErr w:type="gramEnd"/>
     </w:p>
@@ -2272,7 +2272,7 @@
         </w:rPr>
         <w:t xml:space="preserve">6.6 Leakage Control</w:t>
         <w:tab/>
-        <w:t>34</w:t>
+        <w:t>33</w:t>
       </w:r>
       <w:proofErr w:type="gramEnd"/>
     </w:p>
@@ -2290,30 +2290,11 @@
           <w:sz w:val="24"/>
           <w:szCs w:val="24"/>
         </w:rPr>
-        <w:t xml:space="preserve">6.7 Source Code Overview</w:t>
+        <w:t xml:space="preserve">6.7 Web Dashboard and API</w:t>
         <w:tab/>
-        <w:t>35</w:t>
+        <w:t>34</w:t>
       </w:r>
       <w:proofErr w:type="gramEnd"/>
-    </w:p>
-    <w:p>
-      <w:pPr>
-        <w:tabs>
-          <w:tab w:val="right" w:leader="dot" w:pos="8306"/>
-        </w:tabs>
-        <w:spacing w:after="60" w:line="330" w:lineRule="auto"/>
-      </w:pPr>
-      <w:r>
-        <w:rPr>
-          <w:b/>
-          <w:bCs/>
-          <w:sz w:val="26"/>
-          <w:szCs w:val="26"/>
-        </w:rPr>
-        <w:t xml:space="preserve">7.  TESTING AND VALIDATION</w:t>
-        <w:tab/>
-        <w:t>38</w:t>
-      </w:r>
     </w:p>
     <w:p>
       <w:pPr>
@@ -2329,11 +2310,30 @@
           <w:sz w:val="24"/>
           <w:szCs w:val="24"/>
         </w:rPr>
-        <w:t xml:space="preserve">7.1 Testing Strategy</w:t>
+        <w:t xml:space="preserve">6.8 Source Code Overview</w:t>
         <w:tab/>
-        <w:t>38</w:t>
+        <w:t>36</w:t>
       </w:r>
       <w:proofErr w:type="gramEnd"/>
+    </w:p>
+    <w:p>
+      <w:pPr>
+        <w:tabs>
+          <w:tab w:val="right" w:leader="dot" w:pos="8306"/>
+        </w:tabs>
+        <w:spacing w:after="60" w:line="330" w:lineRule="auto"/>
+      </w:pPr>
+      <w:r>
+        <w:rPr>
+          <w:b/>
+          <w:bCs/>
+          <w:sz w:val="26"/>
+          <w:szCs w:val="26"/>
+        </w:rPr>
+        <w:t xml:space="preserve">7.  TESTING AND VALIDATION</w:t>
+        <w:tab/>
+        <w:t>39</w:t>
+      </w:r>
     </w:p>
     <w:p>
       <w:pPr>
@@ -2349,9 +2349,9 @@
           <w:sz w:val="24"/>
           <w:szCs w:val="24"/>
         </w:rPr>
-        <w:t xml:space="preserve">7.2 Unit Testing</w:t>
+        <w:t xml:space="preserve">7.1 Testing Strategy</w:t>
         <w:tab/>
-        <w:t>38</w:t>
+        <w:t>39</w:t>
       </w:r>
       <w:proofErr w:type="gramEnd"/>
     </w:p>
@@ -2369,7 +2369,7 @@
           <w:sz w:val="24"/>
           <w:szCs w:val="24"/>
         </w:rPr>
-        <w:t xml:space="preserve">7.3 Integration Testing</w:t>
+        <w:t xml:space="preserve">7.2 Unit Testing</w:t>
         <w:tab/>
         <w:t>39</w:t>
       </w:r>
@@ -2389,9 +2389,9 @@
           <w:sz w:val="24"/>
           <w:szCs w:val="24"/>
         </w:rPr>
-        <w:t xml:space="preserve">7.4 Injection–Recovery Validation</w:t>
+        <w:t xml:space="preserve">7.3 Integration Testing</w:t>
         <w:tab/>
-        <w:t>39</w:t>
+        <w:t>40</w:t>
       </w:r>
       <w:proofErr w:type="gramEnd"/>
     </w:p>
@@ -2409,7 +2409,7 @@
           <w:sz w:val="24"/>
           <w:szCs w:val="24"/>
         </w:rPr>
-        <w:t xml:space="preserve">7.5 Bug Log Summary</w:t>
+        <w:t xml:space="preserve">7.4 Injection–Recovery Validation</w:t>
         <w:tab/>
         <w:t>40</w:t>
       </w:r>
@@ -2429,30 +2429,11 @@
           <w:sz w:val="24"/>
           <w:szCs w:val="24"/>
         </w:rPr>
-        <w:t xml:space="preserve">7.6 Evaluation Protocol for the Classifier</w:t>
-        <w:tab/>
-        <w:t>40</w:t>
-      </w:r>
-      <w:proofErr w:type="gramEnd"/>
-    </w:p>
-    <w:p>
-      <w:pPr>
-        <w:tabs>
-          <w:tab w:val="right" w:leader="dot" w:pos="8306"/>
-        </w:tabs>
-        <w:spacing w:after="60" w:line="330" w:lineRule="auto"/>
-      </w:pPr>
-      <w:r>
-        <w:rPr>
-          <w:b/>
-          <w:bCs/>
-          <w:sz w:val="26"/>
-          <w:szCs w:val="26"/>
-        </w:rPr>
-        <w:t xml:space="preserve">8.  RESULTS AND DISCUSSION</w:t>
+        <w:t xml:space="preserve">7.5 Bug Log Summary</w:t>
         <w:tab/>
         <w:t>41</w:t>
       </w:r>
+      <w:proofErr w:type="gramEnd"/>
     </w:p>
     <w:p>
       <w:pPr>
@@ -2468,11 +2449,30 @@
           <w:sz w:val="24"/>
           <w:szCs w:val="24"/>
         </w:rPr>
-        <w:t xml:space="preserve">8.1 Experimental Setup</w:t>
+        <w:t xml:space="preserve">7.6 Evaluation Protocol for the Classifier</w:t>
         <w:tab/>
         <w:t>41</w:t>
       </w:r>
       <w:proofErr w:type="gramEnd"/>
+    </w:p>
+    <w:p>
+      <w:pPr>
+        <w:tabs>
+          <w:tab w:val="right" w:leader="dot" w:pos="8306"/>
+        </w:tabs>
+        <w:spacing w:after="60" w:line="330" w:lineRule="auto"/>
+      </w:pPr>
+      <w:r>
+        <w:rPr>
+          <w:b/>
+          <w:bCs/>
+          <w:sz w:val="26"/>
+          <w:szCs w:val="26"/>
+        </w:rPr>
+        <w:t xml:space="preserve">8.  RESULTS AND DISCUSSION</w:t>
+        <w:tab/>
+        <w:t>42</w:t>
+      </w:r>
     </w:p>
     <w:p>
       <w:pPr>
@@ -2488,9 +2488,9 @@
           <w:sz w:val="24"/>
           <w:szCs w:val="24"/>
         </w:rPr>
-        <w:t xml:space="preserve">8.2 Acquisition and Catalogue Statistics (REAL)</w:t>
+        <w:t xml:space="preserve">8.1 Experimental Setup</w:t>
         <w:tab/>
-        <w:t>41</w:t>
+        <w:t>42</w:t>
       </w:r>
       <w:proofErr w:type="gramEnd"/>
     </w:p>
@@ -2508,7 +2508,7 @@
           <w:sz w:val="24"/>
           <w:szCs w:val="24"/>
         </w:rPr>
-        <w:t xml:space="preserve">8.3 Preprocessing Performance</w:t>
+        <w:t xml:space="preserve">8.2 Acquisition and Catalogue Statistics (REAL)</w:t>
         <w:tab/>
         <w:t>42</w:t>
       </w:r>
@@ -2528,9 +2528,9 @@
           <w:sz w:val="24"/>
           <w:szCs w:val="24"/>
         </w:rPr>
-        <w:t xml:space="preserve">8.4 Classification Performance (REAL)</w:t>
+        <w:t xml:space="preserve">8.3 Preprocessing Performance</w:t>
         <w:tab/>
-        <w:t>42</w:t>
+        <w:t>43</w:t>
       </w:r>
       <w:proofErr w:type="gramEnd"/>
     </w:p>
@@ -2548,30 +2548,11 @@
           <w:sz w:val="24"/>
           <w:szCs w:val="24"/>
         </w:rPr>
-        <w:t xml:space="preserve">8.5 Discussion</w:t>
+        <w:t xml:space="preserve">8.4 Classification Performance (REAL)</w:t>
         <w:tab/>
-        <w:t>46</w:t>
+        <w:t>43</w:t>
       </w:r>
       <w:proofErr w:type="gramEnd"/>
-    </w:p>
-    <w:p>
-      <w:pPr>
-        <w:tabs>
-          <w:tab w:val="right" w:leader="dot" w:pos="8306"/>
-        </w:tabs>
-        <w:spacing w:after="60" w:line="330" w:lineRule="auto"/>
-      </w:pPr>
-      <w:r>
-        <w:rPr>
-          <w:b/>
-          <w:bCs/>
-          <w:sz w:val="26"/>
-          <w:szCs w:val="26"/>
-        </w:rPr>
-        <w:t xml:space="preserve">9.  COMPARATIVE ANALYSIS AND IMPACT</w:t>
-        <w:tab/>
-        <w:t>47</w:t>
-      </w:r>
     </w:p>
     <w:p>
       <w:pPr>
@@ -2587,11 +2568,30 @@
           <w:sz w:val="24"/>
           <w:szCs w:val="24"/>
         </w:rPr>
-        <w:t xml:space="preserve">9.1 Comparison of Development Strategies</w:t>
+        <w:t xml:space="preserve">8.5 Discussion</w:t>
         <w:tab/>
         <w:t>47</w:t>
       </w:r>
       <w:proofErr w:type="gramEnd"/>
+    </w:p>
+    <w:p>
+      <w:pPr>
+        <w:tabs>
+          <w:tab w:val="right" w:leader="dot" w:pos="8306"/>
+        </w:tabs>
+        <w:spacing w:after="60" w:line="330" w:lineRule="auto"/>
+      </w:pPr>
+      <w:r>
+        <w:rPr>
+          <w:b/>
+          <w:bCs/>
+          <w:sz w:val="26"/>
+          <w:szCs w:val="26"/>
+        </w:rPr>
+        <w:t xml:space="preserve">9.  COMPARATIVE ANALYSIS AND IMPACT</w:t>
+        <w:tab/>
+        <w:t>48</w:t>
+      </w:r>
     </w:p>
     <w:p>
       <w:pPr>
@@ -2607,30 +2607,11 @@
           <w:sz w:val="24"/>
           <w:szCs w:val="24"/>
         </w:rPr>
-        <w:t xml:space="preserve">9.2 Societal and Educational Impact</w:t>
+        <w:t xml:space="preserve">9.1 Comparison of Development Strategies</w:t>
         <w:tab/>
         <w:t>48</w:t>
       </w:r>
       <w:proofErr w:type="gramEnd"/>
-    </w:p>
-    <w:p>
-      <w:pPr>
-        <w:tabs>
-          <w:tab w:val="right" w:leader="dot" w:pos="8306"/>
-        </w:tabs>
-        <w:spacing w:after="60" w:line="330" w:lineRule="auto"/>
-      </w:pPr>
-      <w:r>
-        <w:rPr>
-          <w:b/>
-          <w:bCs/>
-          <w:sz w:val="26"/>
-          <w:szCs w:val="26"/>
-        </w:rPr>
-        <w:t xml:space="preserve">10.  RISKS, CONCLUSION AND FUTURE ENHANCEMENT</w:t>
-        <w:tab/>
-        <w:t>49</w:t>
-      </w:r>
     </w:p>
     <w:p>
       <w:pPr>
@@ -2646,11 +2627,30 @@
           <w:sz w:val="24"/>
           <w:szCs w:val="24"/>
         </w:rPr>
-        <w:t xml:space="preserve">10.1 Risks and Mitigations</w:t>
+        <w:t xml:space="preserve">9.2 Societal and Educational Impact</w:t>
+        <w:tab/>
+        <w:t>48</w:t>
+      </w:r>
+      <w:proofErr w:type="gramEnd"/>
+    </w:p>
+    <w:p>
+      <w:pPr>
+        <w:tabs>
+          <w:tab w:val="right" w:leader="dot" w:pos="8306"/>
+        </w:tabs>
+        <w:spacing w:after="60" w:line="330" w:lineRule="auto"/>
+      </w:pPr>
+      <w:r>
+        <w:rPr>
+          <w:b/>
+          <w:bCs/>
+          <w:sz w:val="26"/>
+          <w:szCs w:val="26"/>
+        </w:rPr>
+        <w:t xml:space="preserve">10.  RISKS, CONCLUSION AND FUTURE ENHANCEMENT</w:t>
         <w:tab/>
         <w:t>49</w:t>
       </w:r>
-      <w:proofErr w:type="gramEnd"/>
     </w:p>
     <w:p>
       <w:pPr>
@@ -2666,7 +2666,7 @@
           <w:sz w:val="24"/>
           <w:szCs w:val="24"/>
         </w:rPr>
-        <w:t xml:space="preserve">10.2 Limitations</w:t>
+        <w:t xml:space="preserve">10.1 Risks and Mitigations</w:t>
         <w:tab/>
         <w:t>49</w:t>
       </w:r>
@@ -2686,9 +2686,9 @@
           <w:sz w:val="24"/>
           <w:szCs w:val="24"/>
         </w:rPr>
-        <w:t xml:space="preserve">10.3 Conclusion</w:t>
+        <w:t xml:space="preserve">10.2 Limitations</w:t>
         <w:tab/>
-        <w:t>50</w:t>
+        <w:t>49</w:t>
       </w:r>
       <w:proofErr w:type="gramEnd"/>
     </w:p>
@@ -2706,9 +2706,9 @@
           <w:sz w:val="24"/>
           <w:szCs w:val="24"/>
         </w:rPr>
-        <w:t xml:space="preserve">10.4 Future Enhancements</w:t>
+        <w:t xml:space="preserve">10.3 Conclusion</w:t>
         <w:tab/>
-        <w:t>51</w:t>
+        <w:t>50</w:t>
       </w:r>
       <w:proofErr w:type="gramEnd"/>
     </w:p>
@@ -2718,6 +2718,26 @@
           <w:tab w:val="right" w:leader="dot" w:pos="8306"/>
         </w:tabs>
         <w:spacing w:after="60" w:line="330" w:lineRule="auto"/>
+        <w:ind w:left="360"/>
+      </w:pPr>
+      <w:proofErr w:type="gramStart"/>
+      <w:r>
+        <w:rPr>
+          <w:sz w:val="24"/>
+          <w:szCs w:val="24"/>
+        </w:rPr>
+        <w:t xml:space="preserve">10.4 Future Enhancements</w:t>
+        <w:tab/>
+        <w:t>51</w:t>
+      </w:r>
+      <w:proofErr w:type="gramEnd"/>
+    </w:p>
+    <w:p>
+      <w:pPr>
+        <w:tabs>
+          <w:tab w:val="right" w:leader="dot" w:pos="8306"/>
+        </w:tabs>
+        <w:spacing w:after="60" w:line="330" w:lineRule="auto"/>
       </w:pPr>
       <w:r>
         <w:rPr>
@@ -2974,7 +2994,7 @@
         </w:rPr>
         <w:t xml:space="preserve">Table 5.4: Injection parameter ranges</w:t>
         <w:tab/>
-        <w:t>25</w:t>
+        <w:t>24</w:t>
       </w:r>
     </w:p>
     <w:p>
@@ -2991,7 +3011,7 @@
         </w:rPr>
         <w:t xml:space="preserve">Table 6.1: Acquisition parameters</w:t>
         <w:tab/>
-        <w:t>27</w:t>
+        <w:t>26</w:t>
       </w:r>
     </w:p>
     <w:p>
@@ -3008,7 +3028,7 @@
         </w:rPr>
         <w:t xml:space="preserve">Table 6.2: Preprocessing parameters</w:t>
         <w:tab/>
-        <w:t>30</w:t>
+        <w:t>29</w:t>
       </w:r>
     </w:p>
     <w:p>
@@ -3025,7 +3045,7 @@
         </w:rPr>
         <w:t xml:space="preserve">Table 6.3: TLS configuration</w:t>
         <w:tab/>
-        <w:t>30</w:t>
+        <w:t>29</w:t>
       </w:r>
     </w:p>
     <w:p>
@@ -3042,7 +3062,7 @@
         </w:rPr>
         <w:t xml:space="preserve">Table 6.4: Engineered feature groups</w:t>
         <w:tab/>
-        <w:t>31</w:t>
+        <w:t>30</w:t>
       </w:r>
     </w:p>
     <w:p>
@@ -3059,7 +3079,7 @@
         </w:rPr>
         <w:t xml:space="preserve">Table 6.5: Feature-extraction safeguards</w:t>
         <w:tab/>
-        <w:t>33</w:t>
+        <w:t>32</w:t>
       </w:r>
     </w:p>
     <w:p>
@@ -3076,7 +3096,7 @@
         </w:rPr>
         <w:t xml:space="preserve">Table 6.6: Base-learner hyper-parameters (HistGradientBoosting)</w:t>
         <w:tab/>
-        <w:t>34</w:t>
+        <w:t>33</w:t>
       </w:r>
     </w:p>
     <w:p>
@@ -3093,7 +3113,7 @@
         </w:rPr>
         <w:t xml:space="preserve">Table 7.1: Unit test cases</w:t>
         <w:tab/>
-        <w:t>38</w:t>
+        <w:t>39</w:t>
       </w:r>
     </w:p>
     <w:p>
@@ -3110,7 +3130,7 @@
         </w:rPr>
         <w:t xml:space="preserve">Table 7.2: Defects found during testing</w:t>
         <w:tab/>
-        <w:t>40</w:t>
+        <w:t>41</w:t>
       </w:r>
     </w:p>
     <w:p>
@@ -3127,7 +3147,7 @@
         </w:rPr>
         <w:t xml:space="preserve">Table 8.1: Experimental setup</w:t>
         <w:tab/>
-        <w:t>41</w:t>
+        <w:t>42</w:t>
       </w:r>
     </w:p>
     <w:p>
@@ -3144,7 +3164,7 @@
         </w:rPr>
         <w:t xml:space="preserve">Table 8.2: Pipeline data volumes by stage (REAL)</w:t>
         <w:tab/>
-        <w:t>42</w:t>
+        <w:t>43</w:t>
       </w:r>
     </w:p>
     <w:p>
@@ -3161,7 +3181,7 @@
         </w:rPr>
         <w:t xml:space="preserve">Table 8.3: Classifier metrics against project targets (REAL)</w:t>
         <w:tab/>
-        <w:t>43</w:t>
+        <w:t>44</w:t>
       </w:r>
     </w:p>
     <w:p>
@@ -3178,7 +3198,7 @@
         </w:rPr>
         <w:t xml:space="preserve">Table 8.4: Per-class results (REAL)</w:t>
         <w:tab/>
-        <w:t>43</w:t>
+        <w:t>44</w:t>
       </w:r>
     </w:p>
     <w:p>
@@ -3195,7 +3215,7 @@
         </w:rPr>
         <w:t xml:space="preserve">Table 8.5: Top-10 permutation importances (REAL)</w:t>
         <w:tab/>
-        <w:t>45</w:t>
+        <w:t>46</w:t>
       </w:r>
     </w:p>
     <w:p>
@@ -3212,7 +3232,7 @@
         </w:rPr>
         <w:t xml:space="preserve">Table 9.1: Hand-chained scripts versus orchestrated pipeline</w:t>
         <w:tab/>
-        <w:t>47</w:t>
+        <w:t>48</w:t>
       </w:r>
     </w:p>
     <w:p>
@@ -3417,7 +3437,7 @@
         </w:rPr>
         <w:t xml:space="preserve">Figure 6.1: Effect of biweight detrending on a light curve with three transits (illustrative)</w:t>
         <w:tab/>
-        <w:t>28</w:t>
+        <w:t>27</w:t>
       </w:r>
       <w:proofErr w:type="spellStart"/>
       <w:proofErr w:type="spellEnd"/>
@@ -3434,9 +3454,9 @@
           <w:sz w:val="24"/>
           <w:szCs w:val="24"/>
         </w:rPr>
-        <w:t xml:space="preserve">Figure 8.1: Held-out confusion matrix (REAL)</w:t>
+        <w:t xml:space="preserve">Figure 6.2: Live analysis of TIC 316470945 with stage progress and calibrated score</w:t>
         <w:tab/>
-        <w:t>43</w:t>
+        <w:t>34</w:t>
       </w:r>
       <w:proofErr w:type="spellStart"/>
       <w:proofErr w:type="spellEnd"/>
@@ -3453,9 +3473,9 @@
           <w:sz w:val="24"/>
           <w:szCs w:val="24"/>
         </w:rPr>
-        <w:t xml:space="preserve">Figure 8.2: Learning curve on the held-out test set (REAL)</w:t>
+        <w:t xml:space="preserve">Figure 6.3: Candidate explorer ranked by model score</w:t>
         <w:tab/>
-        <w:t>44</w:t>
+        <w:t>35</w:t>
       </w:r>
       <w:proofErr w:type="spellStart"/>
       <w:proofErr w:type="spellEnd"/>
@@ -3472,9 +3492,85 @@
           <w:sz w:val="24"/>
           <w:szCs w:val="24"/>
         </w:rPr>
+        <w:t xml:space="preserve">Figure 6.4: Target page with light curve, phase fold and measured features</w:t>
+        <w:tab/>
+        <w:t>35</w:t>
+      </w:r>
+      <w:proofErr w:type="spellStart"/>
+      <w:proofErr w:type="spellEnd"/>
+    </w:p>
+    <w:p>
+      <w:pPr>
+        <w:tabs>
+          <w:tab w:val="right" w:leader="dot" w:pos="8306"/>
+        </w:tabs>
+        <w:spacing w:after="60" w:line="330" w:lineRule="auto"/>
+      </w:pPr>
+      <w:r>
+        <w:rPr>
+          <w:sz w:val="24"/>
+          <w:szCs w:val="24"/>
+        </w:rPr>
+        <w:t xml:space="preserve">Figure 8.1: Held-out confusion matrix (REAL)</w:t>
+        <w:tab/>
+        <w:t>44</w:t>
+      </w:r>
+      <w:proofErr w:type="spellStart"/>
+      <w:proofErr w:type="spellEnd"/>
+    </w:p>
+    <w:p>
+      <w:pPr>
+        <w:tabs>
+          <w:tab w:val="right" w:leader="dot" w:pos="8306"/>
+        </w:tabs>
+        <w:spacing w:after="60" w:line="330" w:lineRule="auto"/>
+      </w:pPr>
+      <w:r>
+        <w:rPr>
+          <w:sz w:val="24"/>
+          <w:szCs w:val="24"/>
+        </w:rPr>
+        <w:t xml:space="preserve">Figure 8.2: Learning curve on the held-out test set (REAL)</w:t>
+        <w:tab/>
+        <w:t>45</w:t>
+      </w:r>
+      <w:proofErr w:type="spellStart"/>
+      <w:proofErr w:type="spellEnd"/>
+    </w:p>
+    <w:p>
+      <w:pPr>
+        <w:tabs>
+          <w:tab w:val="right" w:leader="dot" w:pos="8306"/>
+        </w:tabs>
+        <w:spacing w:after="60" w:line="330" w:lineRule="auto"/>
+      </w:pPr>
+      <w:r>
+        <w:rPr>
+          <w:sz w:val="24"/>
+          <w:szCs w:val="24"/>
+        </w:rPr>
         <w:t xml:space="preserve">Figure 8.3: Top-12 features by permutation importance (REAL)</w:t>
         <w:tab/>
-        <w:t>45</w:t>
+        <w:t>46</w:t>
+      </w:r>
+      <w:proofErr w:type="spellStart"/>
+      <w:proofErr w:type="spellEnd"/>
+    </w:p>
+    <w:p>
+      <w:pPr>
+        <w:tabs>
+          <w:tab w:val="right" w:leader="dot" w:pos="8306"/>
+        </w:tabs>
+        <w:spacing w:after="60" w:line="330" w:lineRule="auto"/>
+      </w:pPr>
+      <w:r>
+        <w:rPr>
+          <w:sz w:val="24"/>
+          <w:szCs w:val="24"/>
+        </w:rPr>
+        <w:t xml:space="preserve">Figure 8.4: Model performance view of the dashboard</w:t>
+        <w:tab/>
+        <w:t>47</w:t>
       </w:r>
       <w:proofErr w:type="spellStart"/>
       <w:proofErr w:type="spellEnd"/>
@@ -17831,7 +17927,7 @@
         <w:jc w:val="both"/>
       </w:pPr>
       <w:r>
-        <w:t>A first version of the injector drew parameters uniformly and produced many injections that were not scientifically valid: some had an impact parameter larger than one plus the radius ratio, so the planet never crossed the star and the "injected" light curve was byte-identical to its host. Others had periods longer than a third of the baseline, giving fewer than three transits, or were buried below the noise. The injector was therefore rewritten to use rejection sampling. A candidate injection is accepted only if the batman model output shows a real dip, at least three transits fall inside the baseline, the injected signal-to-noise ratio is at least eight, and the host is a label-3 (non-planet) star, so that the label change is unambiguous.</w:t>
+        <w:t xml:space="preserve">A first version of the injector drew parameters uniformly and produced many scientifically invalid injections: some had an impact parameter so large that the planet never crossed the star, so the injected light curve was identical to its host, and others gave fewer than three transits or were buried in noise. The injector was therefore rewritten to use rejection sampling: a candidate is accepted only if the batman model shows a real dip, at least three transits fall inside the baseline, the injected signal-to-noise ratio is at least eight, and the host is a label-3 (non-planet) star.</w:t>
       </w:r>
     </w:p>
     <w:p>
@@ -18583,34 +18679,6 @@
     </w:p>
     <w:p>
       <w:pPr>
-        <w:pStyle w:val="ListParagraph"/>
-        <w:numPr>
-          <w:ilvl w:val="0"/>
-          <w:numId w:val="2"/>
-        </w:numPr>
-        <w:spacing w:after="80" w:line="360" w:lineRule="auto"/>
-        <w:jc w:val="both"/>
-      </w:pPr>
-      <w:r>
-        <w:t>Sexagesimal coordinates: right ascension and declination are stored as strings and must be converted before numeric use.</w:t>
-      </w:r>
-    </w:p>
-    <w:p>
-      <w:pPr>
-        <w:pStyle w:val="ListParagraph"/>
-        <w:numPr>
-          <w:ilvl w:val="0"/>
-          <w:numId w:val="2"/>
-        </w:numPr>
-        <w:spacing w:after="80" w:line="360" w:lineRule="auto"/>
-        <w:jc w:val="both"/>
-      </w:pPr>
-      <w:r>
-        <w:t>Leakage risks: columns such as the absolute transit epoch t0 and the cadence count track how a target was collected rather than any transit property, and were therefore excluded from the model.</w:t>
-      </w:r>
-    </w:p>
-    <w:p>
-      <w:pPr>
         <w:pStyle w:val="Heading2"/>
         <w:keepNext/>
         <w:spacing w:before="320" w:line="360" w:lineRule="auto"/>
@@ -18631,7 +18699,7 @@
         <w:jc w:val="both"/>
       </w:pPr>
       <w:r>
-        <w:t>Random row-wise splitting is inappropriate for this data because a synthetic light curve shares its host star with real targets. The project instead uses group-aware stratified splitting. Every row belongs to a group, which is the target itself for real light curves and the host star for synthetic ones, and all rows of a group stay on the same side of any split. Synthetic rows are used for training only, and held-out evaluation uses real targets exclusively. The current split has 1,741 training rows and 530 held-out test rows, containing 356 Transit and 174 Other targets.</w:t>
+        <w:t xml:space="preserve">Random row-wise splitting is inappropriate because a synthetic light curve shares its host star with real targets. The project therefore uses group-aware stratified splitting: every row belongs to a group (the target itself, or the host star for synthetic rows) and all rows of a group stay on the same side of any split. Synthetic rows are used for training only. The current split has 1,741 training rows and 530 held-out real test rows (356 Transit and 174 Other).</w:t>
       </w:r>
     </w:p>
     <w:p>
@@ -24566,13 +24634,209 @@
     </w:p>
     <w:p>
       <w:pPr>
+        <w:pStyle w:val="Heading2"/>
+        <w:keepNext/>
+        <w:spacing w:before="320" w:line="360" w:lineRule="auto"/>
+      </w:pPr>
+      <w:r>
+        <w:t xml:space="preserve">6.7  Web Dashboard and API</w:t>
+      </w:r>
+    </w:p>
+    <w:p>
+      <w:pPr>
+        <w:spacing w:after="120" w:line="360" w:lineRule="auto"/>
+        <w:jc w:val="both"/>
+      </w:pPr>
+      <w:r>
+        <w:t xml:space="preserve">The pipeline is exposed to researchers through a small web application. A FastAPI service (api/main.py) wraps the pipeline as asynchronous jobs held in a SQLite job store, and streams the progress of each stage to the browser as server-sent events. The front end is a set of static HTML, CSS and JavaScript pages served by the same process, so the whole application starts with one command: uvicorn api.main:app. The screenshots in this section were captured from the running application.</w:t>
+      </w:r>
+    </w:p>
+    <w:p>
+      <w:pPr>
+        <w:spacing w:after="120" w:line="360" w:lineRule="auto"/>
+        <w:jc w:val="both"/>
+      </w:pPr>
+      <w:r>
+        <w:t xml:space="preserve">The Analyze panel (Figure 6.2) accepts a TIC identifier or an uploaded light curve, shows each stage as it completes and returns the calibrated score with the detrended light curve and the phase fold. The candidate explorer (Figure 6.3) ranks the real TESS stars by model score and can be filtered by catalogue label and minimum score, and a target page (Figure 6.4) gives the full light curve, phase fold and measured features of one star.</w:t>
+      </w:r>
+    </w:p>
+    <w:p>
+      <w:pPr>
+        <w:keepNext/>
+        <w:spacing w:before="120" w:after="60"/>
+        <w:jc w:val="center"/>
+      </w:pPr>
+      <w:r>
+        <w:drawing>
+          <wp:inline xmlns:a="http://schemas.openxmlformats.org/drawingml/2006/main" xmlns:pic="http://schemas.openxmlformats.org/drawingml/2006/picture">
+            <wp:extent cx="4206240" cy="2351067"/>
+            <wp:docPr id="96968104" name="Picture 96968104"/>
+            <wp:cNvGraphicFramePr>
+              <a:graphicFrameLocks noChangeAspect="1"/>
+            </wp:cNvGraphicFramePr>
+            <a:graphic>
+              <a:graphicData uri="http://schemas.openxmlformats.org/drawingml/2006/picture">
+                <pic:pic>
+                  <pic:nvPicPr>
+                    <pic:cNvPr id="0" name="ui_2_analyze.jpg"/>
+                    <pic:cNvPicPr/>
+                  </pic:nvPicPr>
+                  <pic:blipFill>
+                    <a:blip r:embed="rId29"/>
+                    <a:stretch>
+                      <a:fillRect/>
+                    </a:stretch>
+                  </pic:blipFill>
+                  <pic:spPr>
+                    <a:xfrm>
+                      <a:off x="0" y="0"/>
+                      <a:ext cx="4206240" cy="2351067"/>
+                    </a:xfrm>
+                    <a:prstGeom prst="rect"/>
+                  </pic:spPr>
+                </pic:pic>
+              </a:graphicData>
+            </a:graphic>
+          </wp:inline>
+        </w:drawing>
+      </w:r>
+    </w:p>
+    <w:p>
+      <w:pPr>
+        <w:spacing w:after="200" w:line="300" w:lineRule="auto"/>
+        <w:jc w:val="center"/>
+      </w:pPr>
+      <w:r>
+        <w:rPr>
+          <w:b/>
+          <w:bCs/>
+          <w:sz w:val="24"/>
+          <w:szCs w:val="24"/>
+        </w:rPr>
+        <w:t xml:space="preserve">Figure 6.2: Live analysis of TIC 316470945 with stage progress and calibrated score</w:t>
+      </w:r>
+    </w:p>
+    <w:p>
+      <w:pPr>
+        <w:keepNext/>
+        <w:spacing w:before="120" w:after="60"/>
+        <w:jc w:val="center"/>
+      </w:pPr>
+      <w:r>
+        <w:drawing>
+          <wp:inline xmlns:a="http://schemas.openxmlformats.org/drawingml/2006/main" xmlns:pic="http://schemas.openxmlformats.org/drawingml/2006/picture">
+            <wp:extent cx="4023360" cy="1666518"/>
+            <wp:docPr id="96968104" name="Picture 96968104"/>
+            <wp:cNvGraphicFramePr>
+              <a:graphicFrameLocks noChangeAspect="1"/>
+            </wp:cNvGraphicFramePr>
+            <a:graphic>
+              <a:graphicData uri="http://schemas.openxmlformats.org/drawingml/2006/picture">
+                <pic:pic>
+                  <pic:nvPicPr>
+                    <pic:cNvPr id="0" name="ui_3_candidates.jpg"/>
+                    <pic:cNvPicPr/>
+                  </pic:nvPicPr>
+                  <pic:blipFill>
+                    <a:blip r:embed="rId30"/>
+                    <a:stretch>
+                      <a:fillRect/>
+                    </a:stretch>
+                  </pic:blipFill>
+                  <pic:spPr>
+                    <a:xfrm>
+                      <a:off x="0" y="0"/>
+                      <a:ext cx="4023360" cy="1666518"/>
+                    </a:xfrm>
+                    <a:prstGeom prst="rect"/>
+                  </pic:spPr>
+                </pic:pic>
+              </a:graphicData>
+            </a:graphic>
+          </wp:inline>
+        </w:drawing>
+      </w:r>
+    </w:p>
+    <w:p>
+      <w:pPr>
+        <w:spacing w:after="200" w:line="300" w:lineRule="auto"/>
+        <w:jc w:val="center"/>
+      </w:pPr>
+      <w:r>
+        <w:rPr>
+          <w:b/>
+          <w:bCs/>
+          <w:sz w:val="24"/>
+          <w:szCs w:val="24"/>
+        </w:rPr>
+        <w:t xml:space="preserve">Figure 6.3: Candidate explorer ranked by model score</w:t>
+      </w:r>
+    </w:p>
+    <w:p>
+      <w:pPr>
+        <w:keepNext/>
+        <w:spacing w:before="120" w:after="60"/>
+        <w:jc w:val="center"/>
+      </w:pPr>
+      <w:r>
+        <w:drawing>
+          <wp:inline xmlns:a="http://schemas.openxmlformats.org/drawingml/2006/main" xmlns:pic="http://schemas.openxmlformats.org/drawingml/2006/picture">
+            <wp:extent cx="3566160" cy="3656503"/>
+            <wp:docPr id="96968104" name="Picture 96968104"/>
+            <wp:cNvGraphicFramePr>
+              <a:graphicFrameLocks noChangeAspect="1"/>
+            </wp:cNvGraphicFramePr>
+            <a:graphic>
+              <a:graphicData uri="http://schemas.openxmlformats.org/drawingml/2006/picture">
+                <pic:pic>
+                  <pic:nvPicPr>
+                    <pic:cNvPr id="0" name="ui_4_target.jpg"/>
+                    <pic:cNvPicPr/>
+                  </pic:nvPicPr>
+                  <pic:blipFill>
+                    <a:blip r:embed="rId31"/>
+                    <a:stretch>
+                      <a:fillRect/>
+                    </a:stretch>
+                  </pic:blipFill>
+                  <pic:spPr>
+                    <a:xfrm>
+                      <a:off x="0" y="0"/>
+                      <a:ext cx="3566160" cy="3656503"/>
+                    </a:xfrm>
+                    <a:prstGeom prst="rect"/>
+                  </pic:spPr>
+                </pic:pic>
+              </a:graphicData>
+            </a:graphic>
+          </wp:inline>
+        </w:drawing>
+      </w:r>
+    </w:p>
+    <w:p>
+      <w:pPr>
+        <w:spacing w:after="200" w:line="300" w:lineRule="auto"/>
+        <w:jc w:val="center"/>
+      </w:pPr>
+      <w:r>
+        <w:rPr>
+          <w:b/>
+          <w:bCs/>
+          <w:sz w:val="24"/>
+          <w:szCs w:val="24"/>
+        </w:rPr>
+        <w:t xml:space="preserve">Figure 6.4: Target page with light curve, phase fold and measured features</w:t>
+      </w:r>
+    </w:p>
+    <w:p>
+      <w:pPr>
         <w:pageBreakBefore/>
         <w:pStyle w:val="Heading2"/>
         <w:keepNext/>
         <w:spacing w:before="320" w:line="360" w:lineRule="auto"/>
       </w:pPr>
       <w:r>
-        <w:t xml:space="preserve">6.7  Source Code Overview</w:t>
+        <w:t xml:space="preserve">6.8  Source Code Overview</w:t>
       </w:r>
     </w:p>
     <w:p>
@@ -36659,6 +36923,71 @@
     </w:p>
     <w:p>
       <w:pPr>
+        <w:spacing w:after="120" w:line="360" w:lineRule="auto"/>
+        <w:jc w:val="both"/>
+      </w:pPr>
+      <w:r>
+        <w:t xml:space="preserve">The dashboard presents the same held-out evaluation in its model-performance view (Figure 8.4): the metric tiles, the confusion matrix and the SHAP feature ranking. The values match Tables 8.3 and 8.4.</w:t>
+      </w:r>
+    </w:p>
+    <w:p>
+      <w:pPr>
+        <w:keepNext/>
+        <w:spacing w:before="120" w:after="60"/>
+        <w:jc w:val="center"/>
+      </w:pPr>
+      <w:r>
+        <w:drawing>
+          <wp:inline xmlns:a="http://schemas.openxmlformats.org/drawingml/2006/main" xmlns:pic="http://schemas.openxmlformats.org/drawingml/2006/picture">
+            <wp:extent cx="4023360" cy="1674988"/>
+            <wp:docPr id="96968105" name="Picture 96968105"/>
+            <wp:cNvGraphicFramePr>
+              <a:graphicFrameLocks noChangeAspect="1"/>
+            </wp:cNvGraphicFramePr>
+            <a:graphic>
+              <a:graphicData uri="http://schemas.openxmlformats.org/drawingml/2006/picture">
+                <pic:pic>
+                  <pic:nvPicPr>
+                    <pic:cNvPr id="0" name="ui_5_model.jpg"/>
+                    <pic:cNvPicPr/>
+                  </pic:nvPicPr>
+                  <pic:blipFill>
+                    <a:blip r:embed="rId32"/>
+                    <a:stretch>
+                      <a:fillRect/>
+                    </a:stretch>
+                  </pic:blipFill>
+                  <pic:spPr>
+                    <a:xfrm>
+                      <a:off x="0" y="0"/>
+                      <a:ext cx="4023360" cy="1674988"/>
+                    </a:xfrm>
+                    <a:prstGeom prst="rect"/>
+                  </pic:spPr>
+                </pic:pic>
+              </a:graphicData>
+            </a:graphic>
+          </wp:inline>
+        </w:drawing>
+      </w:r>
+    </w:p>
+    <w:p>
+      <w:pPr>
+        <w:spacing w:after="200" w:line="300" w:lineRule="auto"/>
+        <w:jc w:val="center"/>
+      </w:pPr>
+      <w:r>
+        <w:rPr>
+          <w:b/>
+          <w:bCs/>
+          <w:sz w:val="24"/>
+          <w:szCs w:val="24"/>
+        </w:rPr>
+        <w:t xml:space="preserve">Figure 8.4: Model performance view of the dashboard</w:t>
+      </w:r>
+    </w:p>
+    <w:p>
+      <w:pPr>
         <w:pStyle w:val="Heading2"/>
         <w:keepNext/>
         <w:spacing w:before="320" w:line="360" w:lineRule="auto"/>
@@ -36674,27 +37003,6 @@
       </w:pPr>
       <w:r>
         <w:t>The results show that the first five stages of the pipeline run at the scale of thousands of light curves without manual intervention between stages, and that a first classifier trained on physically meaningful features reaches a ROC-AUC of 0.75. They also show that the classifier is currently far from the project target of macro-F1 at least 0.90. Three factors explain most of the gap. First, the class Other is heterogeneous: it mixes eclipsing binaries, blends and variable stars, which occupy different regions of feature space, and a binary framing forces the classifier to draw one boundary between transits and all of them. Second, several features that would separate planets from binaries most cleanly, notably true centroid motion and high-resolution secondary-eclipse search, have only just been added or exist as proxies. Third, the training set is small, at 1,741 rows.</w:t>
-      </w:r>
-    </w:p>
-    <w:p>
-      <w:pPr>
-        <w:spacing w:after="120" w:line="360" w:lineRule="auto"/>
-        <w:jc w:val="both"/>
-      </w:pPr>
-      <w:r>
-        <w:t xml:space="preserve">The discussion also highlights the value of the leakage controls. Before the leaky features t0 and </w:t>
-      </w:r>
-      <w:proofErr w:type="spellStart"/>
-      <w:r>
-        <w:t>n_cadences</w:t>
-      </w:r>
-      <w:proofErr w:type="spellEnd"/>
-      <w:r>
-        <w:t xml:space="preserve"> were removed, the reported accuracy </w:t>
-      </w:r>
-      <w:r>
-        <w:lastRenderedPageBreak/>
-        <w:t>would have been higher, but it would have reflected how targets were collected rather than how well transits are recognised. The lower figure obtained here is the more honest estimate of real-world performance.</w:t>
       </w:r>
     </w:p>
     <w:p>
@@ -36735,24 +37043,7 @@
         <w:jc w:val="both"/>
       </w:pPr>
       <w:r>
-        <w:t xml:space="preserve">Chapter 2 compared </w:t>
-      </w:r>
-      <w:proofErr w:type="spellStart"/>
-      <w:r>
-        <w:t>LuNaVision</w:t>
-      </w:r>
-      <w:proofErr w:type="spellEnd"/>
-      <w:r>
-        <w:t xml:space="preserve"> AI with the surveyed literature on architectural capability. A second useful comparison is between the two strategies available to a team building an exoplanet-detection tool today: chain together several independent single-purpose scripts by hand, or build one orchestrated pipeline, as proposed here.</w:t>
-      </w:r>
-    </w:p>
-    <w:p>
-      <w:pPr>
-        <w:spacing w:after="120" w:line="360" w:lineRule="auto"/>
-        <w:jc w:val="both"/>
-      </w:pPr>
-      <w:r>
-        <w:t>The first strategy is faster to a first result, since each script can be written and tested independently with no shared interface to design. It is the strategy implicit in most surveyed papers, each of which reports results from a single stage in isolation. Its cost shows up downstream: every hand-off between scripts is a place where format drift, silent truncation or an unlogged manual filter can enter the analysis, and none of it is visible to a later reviewer. The second strategy costs more up front, since a shared message format, an orchestrator and quality gates have to be designed before the first candidate is classified, but each hand-off becomes a logged, typed message and the same quality-gating and resumability logic applies uniformly whether the run covers one target or a whole sector.</w:t>
+        <w:t xml:space="preserve">The first strategy is faster to a first result, since each script can be written and tested independently, but every hand-off between scripts is a place where format drift, silent truncation or an unlogged manual filter can enter the analysis unseen. The second strategy costs more up front, since a shared message format, an orchestrator and quality gates have to be designed first, but each hand-off becomes a logged, typed message and the same quality gating and resumability apply whether the run covers one target or a whole sector.</w:t>
       </w:r>
     </w:p>
     <w:p>
@@ -37670,7 +37961,7 @@
         <w:jc w:val="both"/>
       </w:pPr>
       <w:r>
-        <w:t>Automated screening does not replace the astronomer, but it shifts effort from routine elimination of false positives to the interesting ambiguous cases. Lower barriers to access could allow smaller institutions to take part in candidate vetting, and an interactive dashboard could be used in teaching to show why a flat-bottomed dip is planetary while a V-shaped one is stellar.</w:t>
+        <w:t xml:space="preserve">Automated screening does not replace the astronomer, but it shifts effort from routine elimination of false positives to the ambiguous cases. Lower barriers to access could allow smaller institutions to take part in candidate vetting, and the dashboard of Section 6.7 can be used in teaching to show why a flat-bottomed dip is planetary while a V-shaped one is stellar.</w:t>
       </w:r>
     </w:p>
     <w:p>

</xml_diff>